<commit_message>
Fix: Kalibrasi total bobot penilaian RPS IF6802 Analisa Data Multivariat tepat 100% dan penyesuaian durasi 16 minggu
</commit_message>
<xml_diff>
--- a/RPS_IF6802_Analisa_Data_Multivariat_UNIROW.docx
+++ b/RPS_IF6802_Analisa_Data_Multivariat_UNIROW.docx
@@ -2468,37 +2468,40 @@
                 <w:color w:val="000000"/>
                 <w:sz w:val="18"/>
               </w:rPr>
-              <w:t>Sub-CPMK1</w:t>
+              <w:t>Sub-CPMK 1</w:t>
               <w:br/>
               <w:br/>
-              <w:t>Sub-CPMK2</w:t>
+              <w:t>Sub-CPMK 2</w:t>
               <w:br/>
               <w:br/>
-              <w:t>Sub-CPMK3</w:t>
+              <w:t>Sub-CPMK 3</w:t>
               <w:br/>
               <w:br/>
-              <w:t>Sub-CPMK4</w:t>
+              <w:t>Sub-CPMK 4</w:t>
               <w:br/>
               <w:br/>
-              <w:t>Sub-CPMK5</w:t>
+              <w:t>Sub-CPMK 5</w:t>
               <w:br/>
               <w:br/>
-              <w:t>Sub-CPMK6</w:t>
+              <w:t>Sub-CPMK 6</w:t>
               <w:br/>
               <w:br/>
-              <w:t>Sub-CPMK7</w:t>
+              <w:t>Sub-CPMK 7</w:t>
               <w:br/>
               <w:br/>
-              <w:t>Sub-CPMK8</w:t>
+              <w:t>Sub-CPMK 8</w:t>
               <w:br/>
               <w:br/>
-              <w:t>Sub-CPMK9</w:t>
+              <w:t>Sub-CPMK 9</w:t>
               <w:br/>
               <w:br/>
-              <w:t>Sub-CPMK10</w:t>
+              <w:t>Sub-CPMK 10</w:t>
               <w:br/>
               <w:br/>
-              <w:t>Sub-CPMK11</w:t>
+              <w:t>Sub-CPMK 11</w:t>
+              <w:br/>
+              <w:br/>
+              <w:t>Sub-CPMK 12 (UTS &amp; UAS)</w:t>
             </w:r>
           </w:p>
         </w:tc>
@@ -2525,37 +2528,40 @@
                 <w:color w:val="000000"/>
                 <w:sz w:val="18"/>
               </w:rPr>
-              <w:t>Sub-CPMK1: Mampu menjelaskan konsep dasar analisis multivariat, taksonomi metode dependence vs independence, representasi matriks data, vektor mean, dan matriks kovarians [C2].</w:t>
+              <w:t>Sub-CPMK 1: Mampu menjelaskan konsep dasar analisis multivariat, taksonomi metode dependence vs independence, representasi matriks data, vektor mean, dan matriks kovarians [C2].</w:t>
               <w:br/>
               <w:br/>
-              <w:t>Sub-CPMK2: Mampu menerapkan pengujian asumsi distribusi normal multivariat (Mardia's test, Royston test, Chi-Square Q-Q Plot) dan mendeteksi pencilan multivariat menggunakan Mahalanobis Distance [C3].</w:t>
+              <w:t>Sub-CPMK 2: Mampu menerapkan pengujian asumsi distribusi normal multivariat (Mardia's test, Royston test, Chi-Square Q-Q Plot) dan mendeteksi pencilan multivariat menggunakan Mahalanobis Distance [C3].</w:t>
               <w:br/>
               <w:br/>
-              <w:t>Sub-CPMK3: Mampu menghitung dan menganalisis reduksi dimensi variabel dengan Principal Component Analysis (PCA) berbasis nilai eigen dan vektor eigen serta interpretasi Scree Plot dan Biplot [C4].</w:t>
+              <w:t>Sub-CPMK 3: Mampu menghitung dan menganalisis reduksi dimensi variabel dengan Principal Component Analysis (PCA) berbasis nilai eigen dan vektor eigen serta interpretasi Scree Plot dan Biplot [C4].</w:t>
               <w:br/>
               <w:br/>
-              <w:t>Sub-CPMK4: Mampu menganalisis struktur faktor laten dengan Exploratory Factor Analysis (EFA) menggunakan rotasi orthogonal (Varimax) dan oblique (Promax), serta interpretasi loading faktor [C4].</w:t>
+              <w:t>Sub-CPMK 4: Mampu menganalisis struktur faktor laten dengan Exploratory Factor Analysis (EFA) menggunakan rotasi orthogonal (Varimax) dan oblique (Promax), serta interpretasi loading faktor [C4].</w:t>
               <w:br/>
               <w:br/>
-              <w:t>Sub-CPMK5: Mampu menganalisis model Regresi Linier Berganda multivariat, diagnosa multikolinieritas (VIF), heteroskedastisitas, dan autokorelasi [C4].</w:t>
+              <w:t>Sub-CPMK 5: Mampu menganalisis model Regresi Linier Berganda multivariat, diagnosa multikolinieritas (VIF), heteroskedastisitas, dan autokorelasi [C4].</w:t>
               <w:br/>
               <w:br/>
-              <w:t>Sub-CPMK6: Mampu menerapkan dan menganalisis model Regresi Logistik Biner dan Multinomial untuk variabel respon kategorik multivariat [C4].</w:t>
+              <w:t>Sub-CPMK 6: Mampu menerapkan dan menganalisis model Regresi Logistik Biner dan Multinomial untuk variabel respon kategorik multivariat [C4].</w:t>
               <w:br/>
               <w:br/>
-              <w:t>Sub-CPMK7: Mampu mengevaluasi perbedaan rata-rata multivariat antar kelompok perlakuan menggunakan MANOVA (Wilks' Lambda, Pillai's Trace, Hotelling's Trace, Roy's Largest Root) [C4, C5].</w:t>
+              <w:t>Sub-CPMK 7: Mampu mengevaluasi perbedaan rata-rata multivariat antar kelompok perlakuan menggunakan MANOVA (Wilks' Lambda, Pillai's Trace, Hotelling's Trace, Roy's Largest Root) [C4, C5].</w:t>
               <w:br/>
               <w:br/>
-              <w:t>Sub-CPMK8: Mampu merancang fungsi pembeda dan mengklasifikasikan observasi baru dengan Analisis Diskriminan Linier (LDA) dan Kuadratik (QDA) [C5].</w:t>
+              <w:t>Sub-CPMK 8: Mampu merancang fungsi pembeda dan mengklasifikasikan observasi baru dengan Analisis Diskriminan Linier (LDA) dan Kuadratik (QDA) [C5].</w:t>
               <w:br/>
               <w:br/>
-              <w:t>Sub-CPMK9: Mampu merancang dan mengevaluasi segmentasi data observasi multivariat menggunakan teknik Hierarchical Clustering (Single, Complete, Average, Ward) dan K-Means Clustering dengan evaluasi koefisien Silhouette [C5, C6].</w:t>
+              <w:t>Sub-CPMK 9: Mampu merancang dan mengevaluasi segmentasi data observasi multivariat menggunakan teknik Hierarchical Clustering (Single, Complete, Average, Ward) dan K-Means Clustering dengan evaluasi koefisien Silhouette [C5, C6].</w:t>
               <w:br/>
               <w:br/>
-              <w:t>Sub-CPMK10: Mampu merancang visualisasi persepsi posisi objek dan asosiasi kategori menggunakan Multidimensional Scaling (MDS) dan Analisis Korespondensi [C5].</w:t>
+              <w:t>Sub-CPMK 10: Mampu merancang visualisasi persepsi posisi objek dan asosiasi kategori menggunakan Multidimensional Scaling (MDS) dan Analisis Korespondensi [C5].</w:t>
               <w:br/>
               <w:br/>
-              <w:t>Sub-CPMK11: Mampu mempresentasikan dan mempertahankan laporan proyek analitik multivariat komprehensif pada dataset riil berdimensi tinggi menggunakan Python/R [C5, C6].</w:t>
+              <w:t>Sub-CPMK 11: Mampu mempresentasikan dan mempertahankan laporan proyek analitik multivariat komprehensif pada dataset riil berdimensi tinggi menggunakan Python/R [C5, C6].</w:t>
+              <w:br/>
+              <w:br/>
+              <w:t>Sub-CPMK 12 (UTS &amp; UAS): Mampu mendemonstrasikan evaluasi komprehensif penguasaan teori dan praktik analitik multivariat melalui Ujian Tengah Semester (15%) dan Ujian Akhir Semester berbasis Capstone Project (15%) [C2, C3, C4, C5, C6].</w:t>
             </w:r>
           </w:p>
         </w:tc>
@@ -3683,7 +3689,7 @@
                       <w:color w:val="000000"/>
                       <w:sz w:val="17"/>
                     </w:rPr>
-                    <w:t>Sub-CPMK1</w:t>
+                    <w:t>Sub-CPMK 1</w:t>
                   </w:r>
                 </w:p>
               </w:tc>
@@ -3780,7 +3786,7 @@
                       <w:color w:val="000000"/>
                       <w:sz w:val="17"/>
                     </w:rPr>
-                    <w:t>0%</w:t>
+                    <w:t>3%</w:t>
                   </w:r>
                 </w:p>
               </w:tc>
@@ -3822,7 +3828,7 @@
                       <w:color w:val="000000"/>
                       <w:sz w:val="17"/>
                     </w:rPr>
-                    <w:t>Sub-CPMK2</w:t>
+                    <w:t>Sub-CPMK 2</w:t>
                   </w:r>
                 </w:p>
               </w:tc>
@@ -3919,7 +3925,7 @@
                       <w:color w:val="000000"/>
                       <w:sz w:val="17"/>
                     </w:rPr>
-                    <w:t>0%</w:t>
+                    <w:t>4%</w:t>
                   </w:r>
                 </w:p>
               </w:tc>
@@ -3961,7 +3967,7 @@
                       <w:color w:val="000000"/>
                       <w:sz w:val="17"/>
                     </w:rPr>
-                    <w:t>Sub-CPMK3</w:t>
+                    <w:t>Sub-CPMK 3</w:t>
                   </w:r>
                 </w:p>
               </w:tc>
@@ -4058,7 +4064,7 @@
                       <w:color w:val="000000"/>
                       <w:sz w:val="17"/>
                     </w:rPr>
-                    <w:t>0%</w:t>
+                    <w:t>7%</w:t>
                   </w:r>
                 </w:p>
               </w:tc>
@@ -4100,7 +4106,7 @@
                       <w:color w:val="000000"/>
                       <w:sz w:val="17"/>
                     </w:rPr>
-                    <w:t>Sub-CPMK4</w:t>
+                    <w:t>Sub-CPMK 4</w:t>
                   </w:r>
                 </w:p>
               </w:tc>
@@ -4197,7 +4203,7 @@
                       <w:color w:val="000000"/>
                       <w:sz w:val="17"/>
                     </w:rPr>
-                    <w:t>0%</w:t>
+                    <w:t>6%</w:t>
                   </w:r>
                 </w:p>
               </w:tc>
@@ -4239,7 +4245,7 @@
                       <w:color w:val="000000"/>
                       <w:sz w:val="17"/>
                     </w:rPr>
-                    <w:t>Sub-CPMK5</w:t>
+                    <w:t>Sub-CPMK 5</w:t>
                   </w:r>
                 </w:p>
               </w:tc>
@@ -4336,7 +4342,7 @@
                       <w:color w:val="000000"/>
                       <w:sz w:val="17"/>
                     </w:rPr>
-                    <w:t>0%</w:t>
+                    <w:t>5%</w:t>
                   </w:r>
                 </w:p>
               </w:tc>
@@ -4378,7 +4384,7 @@
                       <w:color w:val="000000"/>
                       <w:sz w:val="17"/>
                     </w:rPr>
-                    <w:t>Sub-CPMK6</w:t>
+                    <w:t>Sub-CPMK 6</w:t>
                   </w:r>
                 </w:p>
               </w:tc>
@@ -4475,7 +4481,7 @@
                       <w:color w:val="000000"/>
                       <w:sz w:val="17"/>
                     </w:rPr>
-                    <w:t>0%</w:t>
+                    <w:t>5%</w:t>
                   </w:r>
                 </w:p>
               </w:tc>
@@ -4517,7 +4523,7 @@
                       <w:color w:val="000000"/>
                       <w:sz w:val="17"/>
                     </w:rPr>
-                    <w:t>Sub-CPMK7</w:t>
+                    <w:t>Sub-CPMK 7</w:t>
                   </w:r>
                 </w:p>
               </w:tc>
@@ -4614,7 +4620,7 @@
                       <w:color w:val="000000"/>
                       <w:sz w:val="17"/>
                     </w:rPr>
-                    <w:t>0%</w:t>
+                    <w:t>5%</w:t>
                   </w:r>
                 </w:p>
               </w:tc>
@@ -4656,7 +4662,7 @@
                       <w:color w:val="000000"/>
                       <w:sz w:val="17"/>
                     </w:rPr>
-                    <w:t>Sub-CPMK8</w:t>
+                    <w:t>Sub-CPMK 8</w:t>
                   </w:r>
                 </w:p>
               </w:tc>
@@ -4753,7 +4759,7 @@
                       <w:color w:val="000000"/>
                       <w:sz w:val="17"/>
                     </w:rPr>
-                    <w:t>0%</w:t>
+                    <w:t>5%</w:t>
                   </w:r>
                 </w:p>
               </w:tc>
@@ -4795,7 +4801,7 @@
                       <w:color w:val="000000"/>
                       <w:sz w:val="17"/>
                     </w:rPr>
-                    <w:t>Sub-CPMK9</w:t>
+                    <w:t>Sub-CPMK 9</w:t>
                   </w:r>
                 </w:p>
               </w:tc>
@@ -4892,7 +4898,7 @@
                       <w:color w:val="000000"/>
                       <w:sz w:val="17"/>
                     </w:rPr>
-                    <w:t>0%</w:t>
+                    <w:t>10%</w:t>
                   </w:r>
                 </w:p>
               </w:tc>
@@ -4912,7 +4918,7 @@
                       <w:color w:val="000000"/>
                       <w:sz w:val="17"/>
                     </w:rPr>
-                    <w:t>1</w:t>
+                    <w:t>2</w:t>
                   </w:r>
                 </w:p>
               </w:tc>
@@ -4934,7 +4940,7 @@
                       <w:color w:val="000000"/>
                       <w:sz w:val="17"/>
                     </w:rPr>
-                    <w:t>Sub-CPMK10</w:t>
+                    <w:t>Sub-CPMK 10</w:t>
                   </w:r>
                 </w:p>
               </w:tc>
@@ -5031,7 +5037,7 @@
                       <w:color w:val="000000"/>
                       <w:sz w:val="17"/>
                     </w:rPr>
-                    <w:t>0%</w:t>
+                    <w:t>8%</w:t>
                   </w:r>
                 </w:p>
               </w:tc>
@@ -5051,7 +5057,7 @@
                       <w:color w:val="000000"/>
                       <w:sz w:val="17"/>
                     </w:rPr>
-                    <w:t>1</w:t>
+                    <w:t>2</w:t>
                   </w:r>
                 </w:p>
               </w:tc>
@@ -5073,7 +5079,7 @@
                       <w:color w:val="000000"/>
                       <w:sz w:val="17"/>
                     </w:rPr>
-                    <w:t>Sub-CPMK11</w:t>
+                    <w:t>Sub-CPMK 11</w:t>
                   </w:r>
                 </w:p>
               </w:tc>
@@ -5170,7 +5176,7 @@
                       <w:color w:val="000000"/>
                       <w:sz w:val="17"/>
                     </w:rPr>
-                    <w:t>0%</w:t>
+                    <w:t>12%</w:t>
                   </w:r>
                 </w:p>
               </w:tc>
@@ -5190,7 +5196,148 @@
                       <w:color w:val="000000"/>
                       <w:sz w:val="17"/>
                     </w:rPr>
-                    <w:t>1</w:t>
+                    <w:t>2</w:t>
+                  </w:r>
+                </w:p>
+              </w:tc>
+            </w:tr>
+            <w:tr>
+              <w:tc>
+                <w:tcPr>
+                  <w:tcW w:type="dxa" w:w="1006"/>
+                </w:tcPr>
+                <w:p>
+                  <w:pPr>
+                    <w:spacing w:before="40" w:after="40" w:line="252" w:lineRule="auto"/>
+                    <w:jc w:val="left"/>
+                  </w:pPr>
+                  <w:r>
+                    <w:rPr>
+                      <w:rFonts w:ascii="Calibri" w:hAnsi="Calibri"/>
+                      <w:b/>
+                      <w:color w:val="000000"/>
+                      <w:sz w:val="17"/>
+                    </w:rPr>
+                    <w:t>Sub-CPMK 12 (UTS &amp; UAS)</w:t>
+                  </w:r>
+                </w:p>
+              </w:tc>
+              <w:tc>
+                <w:tcPr>
+                  <w:tcW w:type="dxa" w:w="872"/>
+                </w:tcPr>
+                <w:p>
+                  <w:pPr>
+                    <w:spacing w:before="40" w:after="40" w:line="252" w:lineRule="auto"/>
+                    <w:jc w:val="center"/>
+                  </w:pPr>
+                  <w:r>
+                    <w:rPr>
+                      <w:rFonts w:ascii="Calibri" w:hAnsi="Calibri"/>
+                      <w:b w:val="0"/>
+                      <w:color w:val="000000"/>
+                      <w:sz w:val="17"/>
+                    </w:rPr>
+                    <w:t>V</w:t>
+                  </w:r>
+                </w:p>
+              </w:tc>
+              <w:tc>
+                <w:tcPr>
+                  <w:tcW w:type="dxa" w:w="874"/>
+                </w:tcPr>
+                <w:p>
+                  <w:pPr>
+                    <w:spacing w:before="40" w:after="40" w:line="252" w:lineRule="auto"/>
+                    <w:jc w:val="center"/>
+                  </w:pPr>
+                  <w:r>
+                    <w:rPr>
+                      <w:rFonts w:ascii="Calibri" w:hAnsi="Calibri"/>
+                      <w:b w:val="0"/>
+                      <w:color w:val="000000"/>
+                      <w:sz w:val="17"/>
+                    </w:rPr>
+                    <w:t>V</w:t>
+                  </w:r>
+                </w:p>
+              </w:tc>
+              <w:tc>
+                <w:tcPr>
+                  <w:tcW w:type="dxa" w:w="874"/>
+                </w:tcPr>
+                <w:p>
+                  <w:pPr>
+                    <w:spacing w:before="40" w:after="40" w:line="252" w:lineRule="auto"/>
+                    <w:jc w:val="center"/>
+                  </w:pPr>
+                  <w:r>
+                    <w:rPr>
+                      <w:rFonts w:ascii="Calibri" w:hAnsi="Calibri"/>
+                      <w:b w:val="0"/>
+                      <w:color w:val="000000"/>
+                      <w:sz w:val="17"/>
+                    </w:rPr>
+                    <w:t>V</w:t>
+                  </w:r>
+                </w:p>
+              </w:tc>
+              <w:tc>
+                <w:tcPr>
+                  <w:tcW w:type="dxa" w:w="828"/>
+                </w:tcPr>
+                <w:p>
+                  <w:pPr>
+                    <w:spacing w:before="40" w:after="40" w:line="252" w:lineRule="auto"/>
+                    <w:jc w:val="center"/>
+                  </w:pPr>
+                  <w:r>
+                    <w:rPr>
+                      <w:rFonts w:ascii="Calibri" w:hAnsi="Calibri"/>
+                      <w:b w:val="0"/>
+                      <w:color w:val="000000"/>
+                      <w:sz w:val="17"/>
+                    </w:rPr>
+                  </w:r>
+                </w:p>
+              </w:tc>
+              <w:tc>
+                <w:tcPr>
+                  <w:tcW w:type="dxa" w:w="1567"/>
+                </w:tcPr>
+                <w:p>
+                  <w:pPr>
+                    <w:spacing w:before="40" w:after="40" w:line="252" w:lineRule="auto"/>
+                    <w:jc w:val="center"/>
+                  </w:pPr>
+                  <w:r>
+                    <w:rPr>
+                      <w:rFonts w:ascii="Calibri" w:hAnsi="Calibri"/>
+                      <w:b w:val="0"/>
+                      <w:color w:val="000000"/>
+                      <w:sz w:val="17"/>
+                    </w:rPr>
+                    <w:t>30%</w:t>
+                  </w:r>
+                </w:p>
+              </w:tc>
+              <w:tc>
+                <w:tcPr>
+                  <w:tcW w:type="dxa" w:w="1250"/>
+                </w:tcPr>
+                <w:p>
+                  <w:pPr>
+                    <w:spacing w:before="40" w:after="40" w:line="252" w:lineRule="auto"/>
+                    <w:jc w:val="center"/>
+                  </w:pPr>
+                  <w:r>
+                    <w:rPr>
+                      <w:rFonts w:ascii="Calibri" w:hAnsi="Calibri"/>
+                      <w:b w:val="0"/>
+                      <w:color w:val="000000"/>
+                      <w:sz w:val="17"/>
+                    </w:rPr>
+                    <w:t>2</w:t>
                   </w:r>
                 </w:p>
               </w:tc>
@@ -5266,7 +5413,7 @@
                       <w:color w:val="000000"/>
                       <w:sz w:val="17"/>
                     </w:rPr>
-                    <w:t>0%</w:t>
+                    <w:t>100%</w:t>
                   </w:r>
                 </w:p>
               </w:tc>
@@ -5287,7 +5434,7 @@
                       <w:color w:val="000000"/>
                       <w:sz w:val="17"/>
                     </w:rPr>
-                    <w:t>11 Minggu</w:t>
+                    <w:t>16 Minggu</w:t>
                   </w:r>
                 </w:p>
               </w:tc>
@@ -8215,7 +8362,7 @@
                 <w:color w:val="000000"/>
                 <w:sz w:val="17"/>
               </w:rPr>
-              <w:t>5%</w:t>
+              <w:t>3%</w:t>
             </w:r>
           </w:p>
         </w:tc>
@@ -8377,7 +8524,7 @@
                 <w:color w:val="000000"/>
                 <w:sz w:val="17"/>
               </w:rPr>
-              <w:t>5%</w:t>
+              <w:t>4%</w:t>
             </w:r>
           </w:p>
         </w:tc>
@@ -8539,7 +8686,7 @@
                 <w:color w:val="000000"/>
                 <w:sz w:val="17"/>
               </w:rPr>
-              <w:t>8%</w:t>
+              <w:t>7%</w:t>
             </w:r>
           </w:p>
         </w:tc>
@@ -8701,7 +8848,7 @@
                 <w:color w:val="000000"/>
                 <w:sz w:val="17"/>
               </w:rPr>
-              <w:t>7%</w:t>
+              <w:t>6%</w:t>
             </w:r>
           </w:p>
         </w:tc>
@@ -8863,7 +9010,7 @@
                 <w:color w:val="000000"/>
                 <w:sz w:val="17"/>
               </w:rPr>
-              <w:t>7%</w:t>
+              <w:t>5%</w:t>
             </w:r>
           </w:p>
         </w:tc>
@@ -9025,7 +9172,7 @@
                 <w:color w:val="000000"/>
                 <w:sz w:val="17"/>
               </w:rPr>
-              <w:t>8%</w:t>
+              <w:t>5%</w:t>
             </w:r>
           </w:p>
         </w:tc>
@@ -9187,7 +9334,7 @@
                 <w:color w:val="000000"/>
                 <w:sz w:val="17"/>
               </w:rPr>
-              <w:t>10%</w:t>
+              <w:t>5%</w:t>
             </w:r>
           </w:p>
         </w:tc>
@@ -9519,7 +9666,7 @@
                 <w:color w:val="000000"/>
                 <w:sz w:val="17"/>
               </w:rPr>
-              <w:t>6%</w:t>
+              <w:t>5%</w:t>
             </w:r>
           </w:p>
         </w:tc>
@@ -9681,7 +9828,7 @@
                 <w:color w:val="000000"/>
                 <w:sz w:val="17"/>
               </w:rPr>
-              <w:t>7%</w:t>
+              <w:t>5%</w:t>
             </w:r>
           </w:p>
         </w:tc>
@@ -9843,7 +9990,7 @@
                 <w:color w:val="000000"/>
                 <w:sz w:val="17"/>
               </w:rPr>
-              <w:t>7%</w:t>
+              <w:t>5%</w:t>
             </w:r>
           </w:p>
         </w:tc>
@@ -10005,7 +10152,7 @@
                 <w:color w:val="000000"/>
                 <w:sz w:val="17"/>
               </w:rPr>
-              <w:t>5%</w:t>
+              <w:t>4%</w:t>
             </w:r>
           </w:p>
         </w:tc>
@@ -10167,7 +10314,7 @@
                 <w:color w:val="000000"/>
                 <w:sz w:val="17"/>
               </w:rPr>
-              <w:t>5%</w:t>
+              <w:t>4%</w:t>
             </w:r>
           </w:p>
         </w:tc>
@@ -10759,7 +10906,7 @@
                 <w:color w:val="000000"/>
                 <w:sz w:val="18"/>
               </w:rPr>
-              <w:t>122%</w:t>
+              <w:t>100%</w:t>
             </w:r>
           </w:p>
         </w:tc>

</xml_diff>